<commit_message>
Update guides and checksums for validated NetBox Appliance 1.1.0
</commit_message>
<xml_diff>
--- a/NetBox-Appliance-Deployment-Guide.docx
+++ b/NetBox-Appliance-Deployment-Guide.docx
@@ -16,7 +16,7 @@
         <w:widowControl/>
       </w:pPr>
       <w:r>
-        <w:t>Version 0.1.0 | Owner installation walkthrough</w:t>
+        <w:t>Version 1.1.0 | Owner installation walkthrough</w:t>
       </w:r>
     </w:p>
     <w:p>
@@ -33,6 +33,14 @@
       </w:pPr>
       <w:r>
         <w:t>Complete sections 1 through 5 for a working NetBox instance. Sections 6 through 9 are optional connector setup. Section 10 covers checks and troubleshooting. No original lab inventory, accounts or connections are provided.</w:t>
+      </w:r>
+    </w:p>
+    <w:p>
+      <w:pPr>
+        <w:widowControl/>
+      </w:pPr>
+      <w:r>
+        <w:t>Version 1.1 adds VCF Operations inventory observations and optional authoritative DNS discovery. The OVA has no configured sources or owner data. Read the release verification document for the completed deployment tests and their limits.</w:t>
       </w:r>
     </w:p>
     <w:p>
@@ -240,7 +248,7 @@
           <w:rFonts w:ascii="Consolas" w:hAnsi="Consolas"/>
           <w:sz w:val="16"/>
         </w:rPr>
-        <w:t>Get-FileHash ".\NetBox-Appliance-0.1.0.ova" -Algorithm SHA256</w:t>
+        <w:t>Get-FileHash ".\NetBox-Appliance-1.1.0.ova" -Algorithm SHA256</w:t>
       </w:r>
     </w:p>
     <w:p>
@@ -294,7 +302,7 @@
         <w:t>Local file</w:t>
       </w:r>
       <w:r>
-        <w:t xml:space="preserve">, select NetBox-Appliance-0.1.0.ova, and click </w:t>
+        <w:t xml:space="preserve">, select NetBox-Appliance-1.1.0.ova, and click </w:t>
       </w:r>
       <w:r>
         <w:rPr>
@@ -1113,7 +1121,7 @@
         <w:widowControl/>
       </w:pPr>
       <w:r>
-        <w:t>This page is the shared workflow for all four included connector types. You need a NetBox superuser account. The connector manager configures the bundled integrations; it does not install arbitrary third-party plugins.</w:t>
+        <w:t>This page is the shared workflow for all five included connector types. You need a NetBox superuser account. The connector manager configures the bundled integrations; it does not install arbitrary third-party plugins.</w:t>
       </w:r>
     </w:p>
     <w:p>
@@ -1584,6 +1592,111 @@
     </w:p>
     <w:p>
       <w:pPr>
+        <w:pStyle w:val="Heading2"/>
+        <w:widowControl/>
+      </w:pPr>
+      <w:r>
+        <w:t>VCF Operations inventory</w:t>
+      </w:r>
+    </w:p>
+    <w:p>
+      <w:pPr>
+        <w:widowControl/>
+      </w:pPr>
+      <w:r>
+        <w:rPr>
+          <w:b/>
+        </w:rPr>
+        <w:t>7.7 Prepare Operations access.</w:t>
+      </w:r>
+      <w:r>
+        <w:t xml:space="preserve"> Create a dedicated read-only account in your VCF Operations instance, record its endpoint and authentication source, and verify the HTTPS certificate SHA-256 fingerprint through a trusted channel. Identify the VMware adapter instance UUIDs that this connection is allowed to read. Do not use administrator credentials or include passwords in JSON.</w:t>
+      </w:r>
+    </w:p>
+    <w:p>
+      <w:pPr>
+        <w:widowControl/>
+      </w:pPr>
+      <w:r>
+        <w:rPr>
+          <w:b/>
+        </w:rPr>
+        <w:t>7.8 Add the connection.</w:t>
+      </w:r>
+      <w:r>
+        <w:t xml:space="preserve"> Open Appliance Connections, click Add connection, select VCF Operations inventory, and give this instance a unique descriptive Name. Supply Endpoint as a hostname only, Username, Secret and the verified 64-character Certificate sha256. Enter the following configuration with your actual adapter UUIDs:</w:t>
+      </w:r>
+    </w:p>
+    <w:p>
+      <w:pPr>
+        <w:keepLines/>
+        <w:spacing w:line="240" w:lineRule="auto"/>
+        <w:ind w:left="144"/>
+        <w:widowControl/>
+        <w:shd w:fill="F2F2F2"/>
+      </w:pPr>
+      <w:r>
+        <w:rPr>
+          <w:rFonts w:ascii="Consolas" w:hAnsi="Consolas"/>
+          <w:sz w:val="16"/>
+        </w:rPr>
+        <w:t>{</w:t>
+        <w:br/>
+        <w:t xml:space="preserve">  "adapter_instance_ids": [</w:t>
+        <w:br/>
+        <w:t xml:space="preserve">    "11111111-1111-1111-1111-111111111111"</w:t>
+        <w:br/>
+        <w:t xml:space="preserve">  ],</w:t>
+        <w:br/>
+        <w:t xml:space="preserve">  "resource_kinds": [</w:t>
+        <w:br/>
+        <w:t xml:space="preserve">    "VirtualMachine",</w:t>
+        <w:br/>
+        <w:t xml:space="preserve">    "HostSystem",</w:t>
+        <w:br/>
+        <w:t xml:space="preserve">    "ClusterComputeResource"</w:t>
+        <w:br/>
+        <w:t xml:space="preserve">  ],</w:t>
+        <w:br/>
+        <w:t xml:space="preserve">  "auth_source": "",</w:t>
+        <w:br/>
+        <w:t xml:space="preserve">  "max_resources": 1000,</w:t>
+        <w:br/>
+        <w:t xml:space="preserve">  "max_changes": 100</w:t>
+        <w:br/>
+        <w:t>}</w:t>
+      </w:r>
+    </w:p>
+    <w:p>
+      <w:pPr>
+        <w:widowControl/>
+      </w:pPr>
+      <w:r>
+        <w:rPr>
+          <w:b/>
+        </w:rPr>
+        <w:t>7.9 Preview and apply.</w:t>
+      </w:r>
+      <w:r>
+        <w:t xml:space="preserve"> Set Interval seconds to 300, check Enabled and Preview only, and save. Review the Last result and adapter scope. Resolve authentication, certificate or resource-limit errors before proceeding. Then clear Preview only and save. Open View saved Operations inventory to confirm VM, host and cluster observations. Repeat once to verify no duplicate observations.</w:t>
+      </w:r>
+    </w:p>
+    <w:p>
+      <w:pPr>
+        <w:widowControl/>
+      </w:pPr>
+      <w:r>
+        <w:rPr>
+          <w:b/>
+        </w:rPr>
+        <w:t>7.10 Add another instance.</w:t>
+      </w:r>
+      <w:r>
+        <w:t xml:space="preserve"> Repeat with a separate named connection and its own endpoint, account, certificate pin and adapter UUID list. Observations are isolated by connection, so identical resource UUIDs from different instances do not collide. Operations does not overwrite vCenter-managed core VM fields or write source configuration. Missing observations retain their previous last-seen time.</w:t>
+      </w:r>
+    </w:p>
+    <w:p>
+      <w:pPr>
         <w:pStyle w:val="Heading1"/>
         <w:widowControl/>
       </w:pPr>
@@ -1596,7 +1709,7 @@
         <w:widowControl/>
       </w:pPr>
       <w:r>
-        <w:t>This portable connector uses DNS queries. It does not install a Windows scheduled task or require a domain account. It updates the dns_name field of enrolled, existing NetBox IP records; it does not create new IP records or write to Windows DNS.</w:t>
+        <w:t>DNS has two modes in version 1.1. Lookup mode retains the original existing-IP A/PTR reconciliation. Authoritative mode discovers A/AAAA records using owner-authorized zone transfers and can create IPs, overwrite DNS names and reconcile unambiguous address moves within existing NetBox prefixes. Neither mode writes to DNS or deletes IPs. No Windows scheduled task or domain password is required by the portable implementation.</w:t>
       </w:r>
     </w:p>
     <w:p>
@@ -1758,7 +1871,7 @@
         <w:widowControl/>
       </w:pPr>
       <w:r>
-        <w:t>Capabilities outside this portable release</w:t>
+        <w:t>Authoritative DNS setup</w:t>
       </w:r>
     </w:p>
     <w:p>
@@ -1766,7 +1879,150 @@
         <w:widowControl/>
       </w:pPr>
       <w:r>
-        <w:t>VCF Operations, VCF Identity Broker SSO, Windows DHCP leases and controlled DNS creation are not implemented in this OVA's connector manager. They are not enabled by adding a connection or by using settings from another deployment.</w:t>
+        <w:rPr>
+          <w:b/>
+        </w:rPr>
+        <w:t>8.7 Prepare DNS permissions.</w:t>
+      </w:r>
+      <w:r>
+        <w:t xml:space="preserve"> Use two authoritative DNS servers hosting the same forward zone. On each Windows DNS server, open DNS Manager, select the forward zone, open Properties, and use Zone Transfers to allow transfers only to the appliance address. Coordinate this change with your DNS administrator. Never enable transfers to any server. The address DNS sees is the appliance address, or its translated source address when NAT is used. Permit TCP 53 from that source. If organizational policy prohibits AXFR, keep lookup mode; do not enable authoritative mode.</w:t>
+      </w:r>
+    </w:p>
+    <w:p>
+      <w:pPr>
+        <w:widowControl/>
+      </w:pPr>
+      <w:r>
+        <w:rPr>
+          <w:b/>
+        </w:rPr>
+        <w:t>8.8 Prepare NetBox scope.</w:t>
+      </w:r>
+      <w:r>
+        <w:t xml:space="preserve"> Create the real network prefixes in NetBox first, using their correct masks and VRFs. All-prefix mode discovers the current prefix list each run. Addresses outside these prefixes are skipped. Overlapping VRFs and duplicate IP records are held for review. Do not add a broad prefix merely to bypass intended scope.</w:t>
+      </w:r>
+    </w:p>
+    <w:p>
+      <w:pPr>
+        <w:widowControl/>
+      </w:pPr>
+      <w:r>
+        <w:rPr>
+          <w:b/>
+        </w:rPr>
+        <w:t>8.9 Configure the DNS connection.</w:t>
+      </w:r>
+      <w:r>
+        <w:t xml:space="preserve"> Select DNS A/PTR reconciliation, leave credentials and certificate fields blank, and enter the following JSON with your actual server addresses and zone. Use a separate connection per forward zone; avoid overlapping ownership between connections.</w:t>
+      </w:r>
+    </w:p>
+    <w:p>
+      <w:pPr>
+        <w:keepLines/>
+        <w:spacing w:line="240" w:lineRule="auto"/>
+        <w:ind w:left="144"/>
+        <w:widowControl/>
+        <w:shd w:fill="F2F2F2"/>
+      </w:pPr>
+      <w:r>
+        <w:rPr>
+          <w:rFonts w:ascii="Consolas" w:hAnsi="Consolas"/>
+          <w:sz w:val="16"/>
+        </w:rPr>
+        <w:t>{</w:t>
+        <w:br/>
+        <w:t xml:space="preserve">  "mode": "authoritative",</w:t>
+        <w:br/>
+        <w:t xml:space="preserve">  "servers": [</w:t>
+        <w:br/>
+        <w:t xml:space="preserve">    "192.0.2.53",</w:t>
+        <w:br/>
+        <w:t xml:space="preserve">    "192.0.2.54"</w:t>
+        <w:br/>
+        <w:t xml:space="preserve">  ],</w:t>
+        <w:br/>
+        <w:t xml:space="preserve">  "zone": "example.invalid",</w:t>
+        <w:br/>
+        <w:t xml:space="preserve">  "all_existing_prefixes": true,</w:t>
+        <w:br/>
+        <w:t xml:space="preserve">  "max_records": 10000,</w:t>
+        <w:br/>
+        <w:t xml:space="preserve">  "max_changes": 100</w:t>
+        <w:br/>
+        <w:t>}</w:t>
+      </w:r>
+    </w:p>
+    <w:p>
+      <w:pPr>
+        <w:widowControl/>
+      </w:pPr>
+      <w:r>
+        <w:rPr>
+          <w:b/>
+        </w:rPr>
+        <w:t>8.10 Preview.</w:t>
+      </w:r>
+      <w:r>
+        <w:t xml:space="preserve"> Set Interval seconds to 300. Check Enabled and Preview only, save, and wait for a completed run. Confirm prefix_count is nonzero, review every proposed create/update and held record, and verify both DNS replicas agree. A transfer failure or replica disagreement prevents writes. A single new A record does not require a PTR in this mode.</w:t>
+      </w:r>
+    </w:p>
+    <w:p>
+      <w:pPr>
+        <w:widowControl/>
+      </w:pPr>
+      <w:r>
+        <w:rPr>
+          <w:b/>
+        </w:rPr>
+        <w:t>8.11 Apply and verify.</w:t>
+      </w:r>
+      <w:r>
+        <w:t xml:space="preserve"> Clear Preview only after accepting Windows DNS authority for this scope. After the next successful run, check the new IP and DNS Name in NetBox. Repeat collection should report unchanged records. Test with one owner-approved record first, then expand scope. A name with one obsolete NetBox address may move to its new address while retaining the object; ambiguous moves are held. Missing DNS records are retained in NetBox.</w:t>
+      </w:r>
+    </w:p>
+    <w:p>
+      <w:pPr>
+        <w:widowControl/>
+      </w:pPr>
+      <w:r>
+        <w:rPr>
+          <w:b/>
+        </w:rPr>
+        <w:t>8.12 Interpret aliases.</w:t>
+      </w:r>
+      <w:r>
+        <w:t xml:space="preserve"> NetBox stores one DNS name per IP. Authoritative mode keeps an existing name when it is still a valid A/AAAA owner; otherwise it selects the first owner in lexical order and reports all aliases in the result. CNAME aliases do not create duplicate IPs. It does not create VMs or DNS records.</w:t>
+      </w:r>
+    </w:p>
+    <w:p>
+      <w:pPr>
+        <w:widowControl/>
+      </w:pPr>
+      <w:r>
+        <w:rPr>
+          <w:b/>
+        </w:rPr>
+        <w:t>Portable implementation difference.</w:t>
+      </w:r>
+      <w:r>
+        <w:t xml:space="preserve"> This mode uses AXFR directly from the appliance. It is not the Windows management-API scheduled task used in the original lab. Both provide authoritative IP reconciliation, but their permissions, transport and canonical-name rules differ.</w:t>
+      </w:r>
+    </w:p>
+    <w:p>
+      <w:pPr>
+        <w:pStyle w:val="Heading2"/>
+        <w:widowControl/>
+      </w:pPr>
+      <w:r>
+        <w:t>Capabilities outside this portable release</w:t>
+      </w:r>
+    </w:p>
+    <w:p>
+      <w:pPr>
+        <w:widowControl/>
+      </w:pPr>
+      <w:r>
+        <w:t>VCF Identity Broker SSO and controlled DNS record creation are not included. This release imports inventory and does not configure source systems.</w:t>
       </w:r>
     </w:p>
     <w:p>
@@ -2160,7 +2416,7 @@
         <w:widowControl/>
       </w:pPr>
       <w:r>
-        <w:t>This release was qualified with a fresh vSphere import, interactive first boot, HTTPS admin login, connector page access and a restart. Those checks validate the appliance path; your own network, permissions and source endpoints still require the checks above. See NetBox-Appliance-Release-Verification.docx for qualification details and NetBox-Appliance-Build-Guide.docx for rebuilding from source.</w:t>
+        <w:t>See NetBox-Appliance-Release-Verification.docx for the exact OVA checksum, completed deployment tests, patch status and limitations. Qualify your addressing, permissions, source endpoints and backup recovery before production use. NetBox-Appliance-Build-Guide.docx covers rebuilding from source. Plan regular OS and container security maintenance; this appliance does not automatically download updates.</w:t>
       </w:r>
     </w:p>
     <w:p>

</xml_diff>